<commit_message>
updated report complete rmd, html, docx 09_02_2026
</commit_message>
<xml_diff>
--- a/training_complete_examples/report-final.docx
+++ b/training_complete_examples/report-final.docx
@@ -23,10 +23,10 @@
         <w:pStyle w:val="Date"/>
       </w:pPr>
       <w:r>
-        <w:t xml:space="preserve">Last updated: 07/30/2026</w:t>
+        <w:t xml:space="preserve">Last updated: 09/02/2026</w:t>
       </w:r>
     </w:p>
-    <w:bookmarkStart w:id="21" w:name="key-findings"/>
+    <w:bookmarkStart w:id="16" w:name="key-findings"/>
     <w:p>
       <w:pPr>
         <w:pStyle w:val="Heading2"/>
@@ -90,8 +90,8 @@
         <w:t xml:space="preserve">The preterm birth rate was higher for mothers with any diabetes and any hypertension, with a rate 1.6 and 2.7 times the rate for no diabetes and no hypertension, respectively.</w:t>
       </w:r>
     </w:p>
-    <w:bookmarkEnd w:id="21"/>
-    <w:bookmarkStart w:id="22" w:name="X25751b3cf4a0823e6d305dc4993cd8444395744"/>
+    <w:bookmarkEnd w:id="16"/>
+    <w:bookmarkStart w:id="17" w:name="X25751b3cf4a0823e6d305dc4993cd8444395744"/>
     <w:p>
       <w:pPr>
         <w:pStyle w:val="Heading2"/>
@@ -1715,8 +1715,8 @@
         </w:tc>
       </w:tr>
     </w:tbl>
-    <w:bookmarkEnd w:id="22"/>
-    <w:bookmarkStart w:id="26" w:name="X788da46d88f7602893b5786e8d57ef4d17b4f1b"/>
+    <w:bookmarkEnd w:id="17"/>
+    <w:bookmarkStart w:id="21" w:name="X788da46d88f7602893b5786e8d57ef4d17b4f1b"/>
     <w:p>
       <w:pPr>
         <w:pStyle w:val="Heading2"/>
@@ -1750,18 +1750,18 @@
           <wp:inline>
             <wp:extent cx="5943600" cy="4245428"/>
             <wp:effectExtent b="0" l="0" r="0" t="0"/>
-            <wp:docPr descr="" title="" id="24" name="Picture"/>
+            <wp:docPr descr="" title="" id="19" name="Picture"/>
             <a:graphic>
               <a:graphicData uri="http://schemas.openxmlformats.org/drawingml/2006/picture">
                 <pic:pic>
                   <pic:nvPicPr>
-                    <pic:cNvPr descr="report-final_files/report-final_files/figure-docx/unnamed-chunk-2-1.png" id="25" name="Picture"/>
+                    <pic:cNvPr descr="report-final_files/report-final_files/figure-docx/unnamed-chunk-2-1.png" id="20" name="Picture"/>
                     <pic:cNvPicPr>
                       <a:picLocks noChangeArrowheads="1" noChangeAspect="1"/>
                     </pic:cNvPicPr>
                   </pic:nvPicPr>
                   <pic:blipFill>
-                    <a:blip r:embed="rId23"/>
+                    <a:blip r:embed="rId18"/>
                     <a:stretch>
                       <a:fillRect/>
                     </a:stretch>
@@ -1788,8 +1788,8 @@
         </w:drawing>
       </w:r>
     </w:p>
-    <w:bookmarkEnd w:id="26"/>
-    <w:bookmarkStart w:id="30" w:name="X0dc0b35b63e7fc10cf5cc63d6676e3d22b622ce"/>
+    <w:bookmarkEnd w:id="21"/>
+    <w:bookmarkStart w:id="25" w:name="X0dc0b35b63e7fc10cf5cc63d6676e3d22b622ce"/>
     <w:p>
       <w:pPr>
         <w:pStyle w:val="Heading2"/>
@@ -1823,18 +1823,18 @@
           <wp:inline>
             <wp:extent cx="5943600" cy="5943600"/>
             <wp:effectExtent b="0" l="0" r="0" t="0"/>
-            <wp:docPr descr="" title="" id="28" name="Picture"/>
+            <wp:docPr descr="" title="" id="23" name="Picture"/>
             <a:graphic>
               <a:graphicData uri="http://schemas.openxmlformats.org/drawingml/2006/picture">
                 <pic:pic>
                   <pic:nvPicPr>
-                    <pic:cNvPr descr="report-final_files/report-final_files/figure-docx/unnamed-chunk-3-1.png" id="29" name="Picture"/>
+                    <pic:cNvPr descr="report-final_files/report-final_files/figure-docx/unnamed-chunk-3-1.png" id="24" name="Picture"/>
                     <pic:cNvPicPr>
                       <a:picLocks noChangeArrowheads="1" noChangeAspect="1"/>
                     </pic:cNvPicPr>
                   </pic:nvPicPr>
                   <pic:blipFill>
-                    <a:blip r:embed="rId27"/>
+                    <a:blip r:embed="rId22"/>
                     <a:stretch>
                       <a:fillRect/>
                     </a:stretch>
@@ -1861,8 +1861,8 @@
         </w:drawing>
       </w:r>
     </w:p>
-    <w:bookmarkEnd w:id="30"/>
-    <w:bookmarkStart w:id="34" w:name="Xea7fa76ede0f4f47ab6af49642c8ffd4f2ce9ef"/>
+    <w:bookmarkEnd w:id="25"/>
+    <w:bookmarkStart w:id="29" w:name="Xea7fa76ede0f4f47ab6af49642c8ffd4f2ce9ef"/>
     <w:p>
       <w:pPr>
         <w:pStyle w:val="Heading2"/>
@@ -1888,18 +1888,18 @@
           <wp:inline>
             <wp:extent cx="5943600" cy="3396342"/>
             <wp:effectExtent b="0" l="0" r="0" t="0"/>
-            <wp:docPr descr="" title="" id="32" name="Picture"/>
+            <wp:docPr descr="" title="" id="27" name="Picture"/>
             <a:graphic>
               <a:graphicData uri="http://schemas.openxmlformats.org/drawingml/2006/picture">
                 <pic:pic>
                   <pic:nvPicPr>
-                    <pic:cNvPr descr="report-final_files/report-final_files/figure-docx/unnamed-chunk-5-1.png" id="33" name="Picture"/>
+                    <pic:cNvPr descr="report-final_files/report-final_files/figure-docx/unnamed-chunk-5-1.png" id="28" name="Picture"/>
                     <pic:cNvPicPr>
                       <a:picLocks noChangeArrowheads="1" noChangeAspect="1"/>
                     </pic:cNvPicPr>
                   </pic:nvPicPr>
                   <pic:blipFill>
-                    <a:blip r:embed="rId31"/>
+                    <a:blip r:embed="rId26"/>
                     <a:stretch>
                       <a:fillRect/>
                     </a:stretch>
@@ -1926,8 +1926,8 @@
         </w:drawing>
       </w:r>
     </w:p>
-    <w:bookmarkEnd w:id="34"/>
-    <w:bookmarkStart w:id="41" w:name="recommendations"/>
+    <w:bookmarkEnd w:id="29"/>
+    <w:bookmarkStart w:id="36" w:name="recommendations"/>
     <w:p>
       <w:pPr>
         <w:pStyle w:val="Heading2"/>
@@ -1953,18 +1953,18 @@
           <wp:inline>
             <wp:extent cx="3268980" cy="3901134"/>
             <wp:effectExtent b="0" l="0" r="0" t="0"/>
-            <wp:docPr descr="" title="" id="36" name="Picture"/>
+            <wp:docPr descr="" title="" id="31" name="Picture"/>
             <a:graphic>
               <a:graphicData uri="http://schemas.openxmlformats.org/drawingml/2006/picture">
                 <pic:pic>
                   <pic:nvPicPr>
-                    <pic:cNvPr descr="report-final_files/recommendations.png" id="37" name="Picture"/>
+                    <pic:cNvPr descr="report-final_files/recommendations.png" id="32" name="Picture"/>
                     <pic:cNvPicPr>
                       <a:picLocks noChangeArrowheads="1" noChangeAspect="1"/>
                     </pic:cNvPicPr>
                   </pic:nvPicPr>
                   <pic:blipFill>
-                    <a:blip r:embed="rId35"/>
+                    <a:blip r:embed="rId30"/>
                     <a:stretch>
                       <a:fillRect/>
                     </a:stretch>
@@ -1991,7 +1991,7 @@
         </w:drawing>
       </w:r>
     </w:p>
-    <w:bookmarkStart w:id="38" w:name="continued-research"/>
+    <w:bookmarkStart w:id="33" w:name="continued-research"/>
     <w:p>
       <w:pPr>
         <w:pStyle w:val="Heading3"/>
@@ -2008,8 +2008,8 @@
         <w:t xml:space="preserve">Continued analysis is needed to understand the unique drivers of higher preterm birth rates among certain maternal age and race and ethnicity categories in US Territories, which have distinct social and medical environments.</w:t>
       </w:r>
     </w:p>
-    <w:bookmarkEnd w:id="38"/>
-    <w:bookmarkStart w:id="39" w:name="community-engagement"/>
+    <w:bookmarkEnd w:id="33"/>
+    <w:bookmarkStart w:id="34" w:name="community-engagement"/>
     <w:p>
       <w:pPr>
         <w:pStyle w:val="Heading3"/>
@@ -2026,8 +2026,8 @@
         <w:t xml:space="preserve">Working with community members to identify culturally relevant opportunities to address hypertension and diabetes.</w:t>
       </w:r>
     </w:p>
-    <w:bookmarkEnd w:id="39"/>
-    <w:bookmarkStart w:id="40" w:name="partnering-with-providers"/>
+    <w:bookmarkEnd w:id="34"/>
+    <w:bookmarkStart w:id="35" w:name="partnering-with-providers"/>
     <w:p>
       <w:pPr>
         <w:pStyle w:val="Heading3"/>
@@ -2044,9 +2044,9 @@
         <w:t xml:space="preserve">Working with providers through territorial Perinatal Quality Collaboratives and other local collaborative organizations to identify culturally relevant opportunities to address hypertension and diabetes.</w:t>
       </w:r>
     </w:p>
-    <w:bookmarkEnd w:id="40"/>
-    <w:bookmarkEnd w:id="41"/>
-    <w:bookmarkStart w:id="44" w:name="data-source-and-methods"/>
+    <w:bookmarkEnd w:id="35"/>
+    <w:bookmarkEnd w:id="36"/>
+    <w:bookmarkStart w:id="39" w:name="data-source-and-methods"/>
     <w:p>
       <w:pPr>
         <w:pStyle w:val="Heading2"/>
@@ -2065,7 +2065,7 @@
       <w:r>
         <w:t xml:space="preserve"> </w:t>
       </w:r>
-      <w:hyperlink r:id="rId42">
+      <w:hyperlink r:id="rId37">
         <w:r>
           <w:rPr>
             <w:rStyle w:val="Hyperlink"/>
@@ -2149,7 +2149,7 @@
       <w:r>
         <w:t xml:space="preserve"> </w:t>
       </w:r>
-      <w:hyperlink r:id="rId43">
+      <w:hyperlink r:id="rId38">
         <w:r>
           <w:rPr>
             <w:rStyle w:val="Hyperlink"/>
@@ -2161,9 +2161,9 @@
         <w:t xml:space="preserve">.</w:t>
       </w:r>
     </w:p>
-    <w:bookmarkEnd w:id="44"/>
+    <w:bookmarkEnd w:id="39"/>
     <w:sectPr>
-      <w:footerReference r:id="rId12" w:type="default"/>
+      <w:footerReference r:id="rId7" w:type="default"/>
       <w:pgSz w:h="15840" w:w="12240"/>
       <w:pgMar w:bottom="1440" w:footer="708" w:gutter="0" w:header="708" w:left="1440" w:right="1440" w:top="1440"/>
       <w:cols w:space="720"/>
@@ -2178,7 +2178,7 @@
 </file>
 
 <file path=word/footer1.xml><?xml version="1.0" encoding="utf-8"?>
-<w:ftr xmlns:wpc="http://schemas.microsoft.com/office/word/2010/wordprocessingCanvas" xmlns:cx="http://schemas.microsoft.com/office/drawing/2014/chartex" xmlns:cx1="http://schemas.microsoft.com/office/drawing/2015/9/8/chartex" xmlns:cx2="http://schemas.microsoft.com/office/drawing/2015/10/21/chartex" xmlns:cx3="http://schemas.microsoft.com/office/drawing/2016/5/9/chartex" xmlns:cx4="http://schemas.microsoft.com/office/drawing/2016/5/10/chartex" xmlns:cx5="http://schemas.microsoft.com/office/drawing/2016/5/11/chartex" xmlns:cx6="http://schemas.microsoft.com/office/drawing/2016/5/12/chartex" xmlns:cx7="http://schemas.microsoft.com/office/drawing/2016/5/13/chartex" xmlns:cx8="http://schemas.microsoft.com/office/drawing/2016/5/14/chartex" xmlns:mc="http://schemas.openxmlformats.org/markup-compatibility/2006" xmlns:aink="http://schemas.microsoft.com/office/drawing/2016/ink" xmlns:am3d="http://schemas.microsoft.com/office/drawing/2017/model3d" xmlns:o="urn:schemas-microsoft-com:office:office" xmlns:oel="http://schemas.microsoft.com/office/2019/extlst" xmlns:r="http://schemas.openxmlformats.org/officeDocument/2006/relationships" xmlns:m="http://schemas.openxmlformats.org/officeDocument/2006/math" xmlns:v="urn:schemas-microsoft-com:vml" xmlns:wp14="http://schemas.microsoft.com/office/word/2010/wordprocessingDrawing" xmlns:wp="http://schemas.openxmlformats.org/drawingml/2006/wordprocessingDrawing" xmlns:w10="urn:schemas-microsoft-com:office:word" xmlns:w="http://schemas.openxmlformats.org/wordprocessingml/2006/main" xmlns:w14="http://schemas.microsoft.com/office/word/2010/wordml" xmlns:w15="http://schemas.microsoft.com/office/word/2012/wordml" xmlns:w16cex="http://schemas.microsoft.com/office/word/2018/wordml/cex" xmlns:w16cid="http://schemas.microsoft.com/office/word/2016/wordml/cid" xmlns:w16="http://schemas.microsoft.com/office/word/2018/wordml" xmlns:w16du="http://schemas.microsoft.com/office/word/2023/wordml/word16du" xmlns:w16sdtdh="http://schemas.microsoft.com/office/word/2020/wordml/sdtdatahash" xmlns:w16sdtfl="http://schemas.microsoft.com/office/word/2024/wordml/sdtformatlock" xmlns:w16se="http://schemas.microsoft.com/office/word/2015/wordml/symex" xmlns:wpg="http://schemas.microsoft.com/office/word/2010/wordprocessingGroup" xmlns:wpi="http://schemas.microsoft.com/office/word/2010/wordprocessingInk" xmlns:wne="http://schemas.microsoft.com/office/word/2006/wordml" xmlns:wps="http://schemas.microsoft.com/office/word/2010/wordprocessingShape" mc:Ignorable="w14 w15 w16se w16cid w16 w16cex w16sdtdh w16sdtfl w16du wp14">
+<w:ftr xmlns:wpc="http://schemas.microsoft.com/office/word/2010/wordprocessingCanvas" xmlns:cx="http://schemas.microsoft.com/office/drawing/2014/chartex" xmlns:cx1="http://schemas.microsoft.com/office/drawing/2015/9/8/chartex" xmlns:cx2="http://schemas.microsoft.com/office/drawing/2015/10/21/chartex" xmlns:cx3="http://schemas.microsoft.com/office/drawing/2016/5/9/chartex" xmlns:cx4="http://schemas.microsoft.com/office/drawing/2016/5/10/chartex" xmlns:cx5="http://schemas.microsoft.com/office/drawing/2016/5/11/chartex" xmlns:cx6="http://schemas.microsoft.com/office/drawing/2016/5/12/chartex" xmlns:cx7="http://schemas.microsoft.com/office/drawing/2016/5/13/chartex" xmlns:cx8="http://schemas.microsoft.com/office/drawing/2016/5/14/chartex" xmlns:mc="http://schemas.openxmlformats.org/markup-compatibility/2006" xmlns:aink="http://schemas.microsoft.com/office/drawing/2016/ink" xmlns:am3d="http://schemas.microsoft.com/office/drawing/2017/model3d" xmlns:o="urn:schemas-microsoft-com:office:office" xmlns:oel="http://schemas.microsoft.com/office/2019/extlst" xmlns:r="http://schemas.openxmlformats.org/officeDocument/2006/relationships" xmlns:m="http://schemas.openxmlformats.org/officeDocument/2006/math" xmlns:v="urn:schemas-microsoft-com:vml" xmlns:wp14="http://schemas.microsoft.com/office/word/2010/wordprocessingDrawing" xmlns:wp="http://schemas.openxmlformats.org/drawingml/2006/wordprocessingDrawing" xmlns:w10="urn:schemas-microsoft-com:office:word" xmlns:w="http://schemas.openxmlformats.org/wordprocessingml/2006/main" xmlns:w14="http://schemas.microsoft.com/office/word/2010/wordml" xmlns:w15="http://schemas.microsoft.com/office/word/2012/wordml" xmlns:w16cei="http://schemas.microsoft.com/office/word/2026/wordml/cei" xmlns:w16cex="http://schemas.microsoft.com/office/word/2018/wordml/cex" xmlns:w16cid="http://schemas.microsoft.com/office/word/2016/wordml/cid" xmlns:w16="http://schemas.microsoft.com/office/word/2018/wordml" xmlns:w16du="http://schemas.microsoft.com/office/word/2023/wordml/word16du" xmlns:w16sdtdh="http://schemas.microsoft.com/office/word/2020/wordml/sdtdatahash" xmlns:w16sdtfl="http://schemas.microsoft.com/office/word/2024/wordml/sdtformatlock" xmlns:w16se="http://schemas.microsoft.com/office/word/2015/wordml/symex" xmlns:wpg="http://schemas.microsoft.com/office/word/2010/wordprocessingGroup" xmlns:wpi="http://schemas.microsoft.com/office/word/2010/wordprocessingInk" xmlns:wne="http://schemas.microsoft.com/office/word/2006/wordml" xmlns:wps="http://schemas.microsoft.com/office/word/2010/wordprocessingShape" mc:Ignorable="w14 w15 w16se w16cid w16 w16cex w16sdtdh w16sdtfl w16du wp14">
   <w:p>
     <w:pPr>
       <w:jc w:val="center"/>
@@ -2297,7 +2297,7 @@
 </file>
 
 <file path=word/numbering.xml><?xml version="1.0" encoding="utf-8"?>
-<w:numbering xmlns:aink="http://schemas.microsoft.com/office/drawing/2016/ink" xmlns:am3d="http://schemas.microsoft.com/office/drawing/2017/model3d" xmlns:cx="http://schemas.microsoft.com/office/drawing/2014/chartex" xmlns:cx1="http://schemas.microsoft.com/office/drawing/2015/9/8/chartex" xmlns:cx2="http://schemas.microsoft.com/office/drawing/2015/10/21/chartex" xmlns:cx3="http://schemas.microsoft.com/office/drawing/2016/5/9/chartex" xmlns:cx4="http://schemas.microsoft.com/office/drawing/2016/5/10/chartex" xmlns:cx5="http://schemas.microsoft.com/office/drawing/2016/5/11/chartex" xmlns:cx6="http://schemas.microsoft.com/office/drawing/2016/5/12/chartex" xmlns:cx7="http://schemas.microsoft.com/office/drawing/2016/5/13/chartex" xmlns:cx8="http://schemas.microsoft.com/office/drawing/2016/5/14/chartex" xmlns:m="http://schemas.openxmlformats.org/officeDocument/2006/math" xmlns:mc="http://schemas.openxmlformats.org/markup-compatibility/2006" xmlns:o="urn:schemas-microsoft-com:office:office" xmlns:oel="http://schemas.microsoft.com/office/2019/extlst" xmlns:r="http://schemas.openxmlformats.org/officeDocument/2006/relationships" xmlns:v="urn:schemas-microsoft-com:vml" xmlns:w="http://schemas.openxmlformats.org/wordprocessingml/2006/main" xmlns:w10="urn:schemas-microsoft-com:office:word" xmlns:w14="http://schemas.microsoft.com/office/word/2010/wordml" xmlns:w15="http://schemas.microsoft.com/office/word/2012/wordml" xmlns:w16="http://schemas.microsoft.com/office/word/2018/wordml" xmlns:w16cex="http://schemas.microsoft.com/office/word/2018/wordml/cex" xmlns:w16cid="http://schemas.microsoft.com/office/word/2016/wordml/cid" xmlns:w16du="http://schemas.microsoft.com/office/word/2023/wordml/word16du" xmlns:w16sdtdh="http://schemas.microsoft.com/office/word/2020/wordml/sdtdatahash" xmlns:w16sdtfl="http://schemas.microsoft.com/office/word/2024/wordml/sdtformatlock" xmlns:w16se="http://schemas.microsoft.com/office/word/2015/wordml/symex" xmlns:wne="http://schemas.microsoft.com/office/word/2006/wordml" xmlns:wp="http://schemas.openxmlformats.org/drawingml/2006/wordprocessingDrawing" xmlns:wp14="http://schemas.microsoft.com/office/word/2010/wordprocessingDrawing" xmlns:wpc="http://schemas.microsoft.com/office/word/2010/wordprocessingCanvas" xmlns:wpg="http://schemas.microsoft.com/office/word/2010/wordprocessingGroup" xmlns:wpi="http://schemas.microsoft.com/office/word/2010/wordprocessingInk" xmlns:wps="http://schemas.microsoft.com/office/word/2010/wordprocessingShape" mc:Ignorable="w14 w15 w16se w16cid w16 w16cex w16sdtdh w16sdtfl w16du wp14">
+<w:numbering xmlns:aink="http://schemas.microsoft.com/office/drawing/2016/ink" xmlns:am3d="http://schemas.microsoft.com/office/drawing/2017/model3d" xmlns:cx="http://schemas.microsoft.com/office/drawing/2014/chartex" xmlns:cx1="http://schemas.microsoft.com/office/drawing/2015/9/8/chartex" xmlns:cx2="http://schemas.microsoft.com/office/drawing/2015/10/21/chartex" xmlns:cx3="http://schemas.microsoft.com/office/drawing/2016/5/9/chartex" xmlns:cx4="http://schemas.microsoft.com/office/drawing/2016/5/10/chartex" xmlns:cx5="http://schemas.microsoft.com/office/drawing/2016/5/11/chartex" xmlns:cx6="http://schemas.microsoft.com/office/drawing/2016/5/12/chartex" xmlns:cx7="http://schemas.microsoft.com/office/drawing/2016/5/13/chartex" xmlns:cx8="http://schemas.microsoft.com/office/drawing/2016/5/14/chartex" xmlns:m="http://schemas.openxmlformats.org/officeDocument/2006/math" xmlns:mc="http://schemas.openxmlformats.org/markup-compatibility/2006" xmlns:o="urn:schemas-microsoft-com:office:office" xmlns:oel="http://schemas.microsoft.com/office/2019/extlst" xmlns:r="http://schemas.openxmlformats.org/officeDocument/2006/relationships" xmlns:v="urn:schemas-microsoft-com:vml" xmlns:w="http://schemas.openxmlformats.org/wordprocessingml/2006/main" xmlns:w10="urn:schemas-microsoft-com:office:word" xmlns:w14="http://schemas.microsoft.com/office/word/2010/wordml" xmlns:w15="http://schemas.microsoft.com/office/word/2012/wordml" xmlns:w16="http://schemas.microsoft.com/office/word/2018/wordml" xmlns:w16cei="http://schemas.microsoft.com/office/word/2026/wordml/cei" xmlns:w16cex="http://schemas.microsoft.com/office/word/2018/wordml/cex" xmlns:w16cid="http://schemas.microsoft.com/office/word/2016/wordml/cid" xmlns:w16du="http://schemas.microsoft.com/office/word/2023/wordml/word16du" xmlns:w16sdtdh="http://schemas.microsoft.com/office/word/2020/wordml/sdtdatahash" xmlns:w16sdtfl="http://schemas.microsoft.com/office/word/2024/wordml/sdtformatlock" xmlns:w16se="http://schemas.microsoft.com/office/word/2015/wordml/symex" xmlns:wne="http://schemas.microsoft.com/office/word/2006/wordml" xmlns:wp="http://schemas.openxmlformats.org/drawingml/2006/wordprocessingDrawing" xmlns:wp14="http://schemas.microsoft.com/office/word/2010/wordprocessingDrawing" xmlns:wpc="http://schemas.microsoft.com/office/word/2010/wordprocessingCanvas" xmlns:wpg="http://schemas.microsoft.com/office/word/2010/wordprocessingGroup" xmlns:wpi="http://schemas.microsoft.com/office/word/2010/wordprocessingInk" xmlns:wps="http://schemas.microsoft.com/office/word/2010/wordprocessingShape" mc:Ignorable="w14 w15 w16se w16cid w16 w16cex w16sdtdh w16sdtfl w16du wp14">
   <w:abstractNum w15:restartNumberingAfterBreak="0" w:abstractNumId="0">
     <w:nsid w:val="0000A990"/>
     <w:multiLevelType w:val="multilevel"/>
@@ -3447,7 +3447,6 @@
   <w:style w:default="1" w:styleId="DefaultParagraphFont" w:type="character">
     <w:name w:val="Default Paragraph Font"/>
     <w:uiPriority w:val="1"/>
-    <w:semiHidden/>
     <w:unhideWhenUsed/>
   </w:style>
   <w:style w:default="1" w:styleId="TableNormal" w:type="table">
@@ -3928,7 +3927,7 @@
     <w:link w:val="SubtitleChar"/>
     <w:uiPriority w:val="11"/>
     <w:qFormat/>
-    <w:rsid w:val="00CF6643"/>
+    <w:rsid w:val="00D94336"/>
     <w:pPr>
       <w:numPr>
         <w:ilvl w:val="1"/>
@@ -3946,11 +3945,20 @@
     <w:basedOn w:val="DefaultParagraphFont"/>
     <w:link w:val="Subtitle"/>
     <w:uiPriority w:val="11"/>
-    <w:rsid w:val="00CF6643"/>
+    <w:rsid w:val="00D94336"/>
     <w:rPr>
       <w:rFonts w:cstheme="minorBidi" w:eastAsiaTheme="minorEastAsia"/>
       <w:b/>
       <w:color w:themeColor="text1" w:themeTint="A5" w:val="5A5A5A"/>
+      <w:sz w:val="24"/>
+    </w:rPr>
+  </w:style>
+  <w:style w:styleId="NoSpacing" w:type="paragraph">
+    <w:name w:val="No Spacing"/>
+    <w:uiPriority w:val="1"/>
+    <w:qFormat/>
+    <w:rsid w:val="00712DB7"/>
+    <w:rPr>
       <w:sz w:val="24"/>
     </w:rPr>
   </w:style>

</xml_diff>